<commit_message>
Deploying to gh-pages from @ Morrison-Lab/mds@b2e0351b1b4516ee65eafaf649479205878867b9 🚀
</commit_message>
<xml_diff>
--- a/linear-algebra.docx
+++ b/linear-algebra.docx
@@ -15,10 +15,10 @@
         <w:pStyle w:val="Date"/>
       </w:pPr>
       <w:r>
-        <w:t xml:space="preserve">Last modified: 2026-09-28 06:17:29 (PDT)</w:t>
+        <w:t xml:space="preserve">Last modified: 2026-09-28 15:10:58 (PDT)</w:t>
       </w:r>
     </w:p>
-    <w:bookmarkStart w:id="31" w:name="vectors"/>
+    <w:bookmarkStart w:id="36" w:name="vectors"/>
     <w:p>
       <w:pPr>
         <w:pStyle w:val="Heading2"/>
@@ -4038,7 +4038,7 @@
       </m:oMathPara>
     </w:p>
     <w:bookmarkEnd w:id="25"/>
-    <w:bookmarkStart w:id="30" w:name="orthogonality"/>
+    <w:bookmarkStart w:id="35" w:name="orthogonality"/>
     <w:p>
       <w:pPr>
         <w:pStyle w:val="Heading3"/>
@@ -5238,9 +5238,183 @@
         <w:t xml:space="preserve">) form an orthonormal set.</w:t>
       </w:r>
     </w:p>
-    <w:bookmarkEnd w:id="30"/>
-    <w:bookmarkEnd w:id="31"/>
-    <w:bookmarkStart w:id="64" w:name="matrices"/>
+    <w:tbl>
+      <w:tblPr>
+        <w:tblStyle w:val="Table"/>
+        <w:tblLook w:firstRow="0" w:lastRow="0" w:firstColumn="0" w:lastColumn="0" w:noHBand="0" w:noVBand="0" w:val="0000"/>
+        <w:tblBorders>
+          <w:top w:val="single" w:sz="4" w:space="0" w:color="00A047"/>
+          <w:left w:val="single" w:sz="24" w:space="0" w:color="00A047"/>
+          <w:bottom w:val="single" w:sz="4" w:space="0" w:color="00A047"/>
+          <w:right w:val="single" w:sz="4" w:space="0" w:color="00A047"/>
+        </w:tblBorders>
+        <w:tblCellMar>
+          <w:left w:w="144" w:type="dxa"/>
+          <w:right w:w="144" w:type="dxa"/>
+        </w:tblCellMar>
+        <w:tblLook w:firstRow="0" w:lastRow="0" w:firstColumn="0" w:lastColumn="0" w:noHBand="0" w:noVBand="0" w:val="0000"/>
+      </w:tblPr>
+      <w:tr>
+        <w:trPr>
+          <w:cantSplit/>
+        </w:trPr>
+        <w:tc>
+          <w:tcPr>
+            <w:shd w:color="auto" w:fill="ccf1e3" w:val="clear"/>
+            <w:tcMar>
+              <w:top w:w="92" w:type="dxa"/>
+              <w:bottom w:w="92" w:type="dxa"/>
+            </w:tcMar>
+          </w:tcPr>
+          <w:p>
+            <w:pPr>
+              <w:pStyle w:val="BodyText"/>
+            </w:pPr>
+            <w:pPr>
+              <w:spacing w:before="0" w:after="0"/>
+              <w:textAlignment w:val="center"/>
+            </w:pPr>
+            <w:r>
+              <w:drawing>
+                <wp:inline>
+                  <wp:extent cx="152400" cy="152400"/>
+                  <wp:effectExtent b="0" l="0" r="0" t="0"/>
+                  <wp:docPr descr="" title="" id="31" name="Picture"/>
+                  <a:graphic>
+                    <a:graphicData uri="http://schemas.openxmlformats.org/drawingml/2006/picture">
+                      <pic:pic>
+                        <pic:nvPicPr>
+                          <pic:cNvPr descr="/opt/quarto/share/formats/docx/tip.png" id="32" name="Picture"/>
+                          <pic:cNvPicPr>
+                            <a:picLocks noChangeArrowheads="1" noChangeAspect="1"/>
+                          </pic:cNvPicPr>
+                        </pic:nvPicPr>
+                        <pic:blipFill>
+                          <a:blip r:embed="rId30"/>
+                          <a:stretch>
+                            <a:fillRect/>
+                          </a:stretch>
+                        </pic:blipFill>
+                        <pic:spPr bwMode="auto">
+                          <a:xfrm>
+                            <a:off x="0" y="0"/>
+                            <a:ext cx="152400" cy="152400"/>
+                          </a:xfrm>
+                          <a:prstGeom prst="rect">
+                            <a:avLst/>
+                          </a:prstGeom>
+                          <a:noFill/>
+                          <a:ln w="9525">
+                            <a:noFill/>
+                            <a:headEnd/>
+                            <a:tailEnd/>
+                          </a:ln>
+                        </pic:spPr>
+                      </pic:pic>
+                    </a:graphicData>
+                  </a:graphic>
+                </wp:inline>
+              </w:drawing>
+            </w:r>
+            <w:r>
+              <w:t xml:space="preserve"> </w:t>
+            </w:r>
+            <w:r>
+              <w:t xml:space="preserve"> </w:t>
+            </w:r>
+            <w:r>
+              <w:t xml:space="preserve">Video lecture</w:t>
+            </w:r>
+          </w:p>
+        </w:tc>
+      </w:tr>
+      <w:tr>
+        <w:trPr>
+          <w:cantSplit/>
+        </w:trPr>
+        <w:tc>
+          <w:tcPr>
+            <w:tcMar>
+              <w:top w:w="108" w:type="dxa"/>
+              <w:bottom w:w="108" w:type="dxa"/>
+            </w:tcMar>
+          </w:tcPr>
+          <w:p>
+            <w:pPr>
+              <w:pStyle w:val="BodyText"/>
+            </w:pPr>
+            <w:pPr>
+              <w:spacing w:before="16" w:after="16"/>
+            </w:pPr>
+            <w:r>
+              <w:t xml:space="preserve">Hutchinson’s</w:t>
+            </w:r>
+            <w:r>
+              <w:t xml:space="preserve"> </w:t>
+            </w:r>
+            <w:hyperlink r:id="rId33">
+              <w:r>
+                <w:rPr>
+                  <w:rStyle w:val="Hyperlink"/>
+                </w:rPr>
+                <w:t xml:space="preserve">Linear Function Basics</w:t>
+              </w:r>
+            </w:hyperlink>
+            <w:r>
+              <w:t xml:space="preserve"> </w:t>
+            </w:r>
+            <w:r>
+              <w:t xml:space="preserve">(24 min)</w:t>
+            </w:r>
+            <w:r>
+              <w:t xml:space="preserve"> </w:t>
+            </w:r>
+            <w:r>
+              <w:t xml:space="preserve">covers dot products and the Euclidean norm,</w:t>
+            </w:r>
+            <w:r>
+              <w:t xml:space="preserve"> </w:t>
+            </w:r>
+            <w:r>
+              <w:t xml:space="preserve">and goes on to hyperplanes and level sets</w:t>
+            </w:r>
+            <w:r>
+              <w:t xml:space="preserve"> </w:t>
+            </w:r>
+            <w:r>
+              <w:t xml:space="preserve">(Hutchinson, n.d.)</w:t>
+            </w:r>
+            <w:r>
+              <w:t xml:space="preserve">.</w:t>
+            </w:r>
+            <w:r>
+              <w:t xml:space="preserve"> </w:t>
+            </w:r>
+            <w:r>
+              <w:t xml:space="preserve">The login for the video site is posted</w:t>
+            </w:r>
+            <w:r>
+              <w:t xml:space="preserve"> </w:t>
+            </w:r>
+            <w:hyperlink r:id="rId34">
+              <w:r>
+                <w:rPr>
+                  <w:rStyle w:val="Hyperlink"/>
+                </w:rPr>
+                <w:t xml:space="preserve">on Canvas</w:t>
+              </w:r>
+            </w:hyperlink>
+            <w:r>
+              <w:t xml:space="preserve">.</w:t>
+            </w:r>
+          </w:p>
+          <w:p/>
+        </w:tc>
+      </w:tr>
+    </w:tbl>
+    <w:bookmarkEnd w:id="35"/>
+    <w:bookmarkEnd w:id="36"/>
+    <w:bookmarkStart w:id="69" w:name="matrices"/>
     <w:p>
       <w:pPr>
         <w:pStyle w:val="Heading2"/>
@@ -5249,7 +5423,7 @@
         <w:t xml:space="preserve">2 Matrices</w:t>
       </w:r>
     </w:p>
-    <w:bookmarkStart w:id="32" w:name="def-matrix"/>
+    <w:bookmarkStart w:id="37" w:name="def-matrix"/>
     <w:p>
       <w:pPr>
         <w:pStyle w:val="FirstParagraph"/>
@@ -5635,7 +5809,7 @@
         </m:oMath>
       </m:oMathPara>
     </w:p>
-    <w:bookmarkEnd w:id="32"/>
+    <w:bookmarkEnd w:id="37"/>
     <w:p>
       <w:pPr>
         <w:pStyle w:val="FirstParagraph"/>
@@ -5822,7 +5996,7 @@
         <w:t xml:space="preserve">matrix.</w:t>
       </w:r>
     </w:p>
-    <w:bookmarkStart w:id="34" w:name="sec-matrix-transpose"/>
+    <w:bookmarkStart w:id="39" w:name="sec-matrix-transpose"/>
     <w:p>
       <w:pPr>
         <w:pStyle w:val="Heading3"/>
@@ -5831,7 +6005,7 @@
         <w:t xml:space="preserve">2.1 Matrix transpose</w:t>
       </w:r>
     </w:p>
-    <w:bookmarkStart w:id="33" w:name="def-matrix-transpose"/>
+    <w:bookmarkStart w:id="38" w:name="def-matrix-transpose"/>
     <w:p>
       <w:pPr>
         <w:pStyle w:val="FirstParagraph"/>
@@ -6053,9 +6227,9 @@
         </m:oMath>
       </m:oMathPara>
     </w:p>
-    <w:bookmarkEnd w:id="33"/>
-    <w:bookmarkEnd w:id="34"/>
-    <w:bookmarkStart w:id="41" w:name="matrix-addition"/>
+    <w:bookmarkEnd w:id="38"/>
+    <w:bookmarkEnd w:id="39"/>
+    <w:bookmarkStart w:id="46" w:name="matrix-addition"/>
     <w:p>
       <w:pPr>
         <w:pStyle w:val="Heading3"/>
@@ -6064,7 +6238,7 @@
         <w:t xml:space="preserve">2.2 Matrix addition</w:t>
       </w:r>
     </w:p>
-    <w:bookmarkStart w:id="35" w:name="def-zero-matrix"/>
+    <w:bookmarkStart w:id="40" w:name="def-zero-matrix"/>
     <w:p>
       <w:pPr>
         <w:pStyle w:val="FirstParagraph"/>
@@ -6361,8 +6535,8 @@
         </m:oMath>
       </m:oMathPara>
     </w:p>
-    <w:bookmarkEnd w:id="35"/>
-    <w:bookmarkStart w:id="36" w:name="def-matrix-addition"/>
+    <w:bookmarkEnd w:id="40"/>
+    <w:bookmarkStart w:id="41" w:name="def-matrix-addition"/>
     <w:p>
       <w:pPr>
         <w:pStyle w:val="FirstParagraph"/>
@@ -6550,8 +6724,8 @@
         </m:oMath>
       </m:oMathPara>
     </w:p>
-    <w:bookmarkEnd w:id="36"/>
-    <w:bookmarkStart w:id="37" w:name="thm-matadd-commutative"/>
+    <w:bookmarkEnd w:id="41"/>
+    <w:bookmarkStart w:id="42" w:name="thm-matadd-commutative"/>
     <w:p>
       <w:pPr>
         <w:pStyle w:val="FirstParagraph"/>
@@ -6678,8 +6852,8 @@
         </m:oMath>
       </m:oMathPara>
     </w:p>
-    <w:bookmarkEnd w:id="37"/>
-    <w:bookmarkStart w:id="38" w:name="thm-matadd-assoc"/>
+    <w:bookmarkEnd w:id="42"/>
+    <w:bookmarkStart w:id="43" w:name="thm-matadd-assoc"/>
     <w:p>
       <w:pPr>
         <w:pStyle w:val="FirstParagraph"/>
@@ -6865,8 +7039,8 @@
         </m:oMath>
       </m:oMathPara>
     </w:p>
-    <w:bookmarkEnd w:id="38"/>
-    <w:bookmarkStart w:id="39" w:name="thm-matadd-identity"/>
+    <w:bookmarkEnd w:id="43"/>
+    <w:bookmarkStart w:id="44" w:name="thm-matadd-identity"/>
     <w:p>
       <w:pPr>
         <w:pStyle w:val="FirstParagraph"/>
@@ -6982,8 +7156,8 @@
         </m:oMath>
       </m:oMathPara>
     </w:p>
-    <w:bookmarkEnd w:id="39"/>
-    <w:bookmarkStart w:id="40" w:name="thm-matadd-inverse"/>
+    <w:bookmarkEnd w:id="44"/>
+    <w:bookmarkStart w:id="45" w:name="thm-matadd-inverse"/>
     <w:p>
       <w:pPr>
         <w:pStyle w:val="FirstParagraph"/>
@@ -7234,9 +7408,9 @@
         </m:oMath>
       </m:oMathPara>
     </w:p>
-    <w:bookmarkEnd w:id="40"/>
-    <w:bookmarkEnd w:id="41"/>
-    <w:bookmarkStart w:id="43" w:name="scalar-multiplication"/>
+    <w:bookmarkEnd w:id="45"/>
+    <w:bookmarkEnd w:id="46"/>
+    <w:bookmarkStart w:id="48" w:name="scalar-multiplication"/>
     <w:p>
       <w:pPr>
         <w:pStyle w:val="Heading3"/>
@@ -7245,7 +7419,7 @@
         <w:t xml:space="preserve">2.3 Scalar multiplication</w:t>
       </w:r>
     </w:p>
-    <w:bookmarkStart w:id="42" w:name="def-scalar-mult"/>
+    <w:bookmarkStart w:id="47" w:name="def-scalar-mult"/>
     <w:p>
       <w:pPr>
         <w:pStyle w:val="FirstParagraph"/>
@@ -7386,9 +7560,9 @@
         </m:oMath>
       </m:oMathPara>
     </w:p>
-    <w:bookmarkEnd w:id="42"/>
-    <w:bookmarkEnd w:id="43"/>
-    <w:bookmarkStart w:id="48" w:name="matrix-multiplication"/>
+    <w:bookmarkEnd w:id="47"/>
+    <w:bookmarkEnd w:id="48"/>
+    <w:bookmarkStart w:id="53" w:name="matrix-multiplication"/>
     <w:p>
       <w:pPr>
         <w:pStyle w:val="Heading3"/>
@@ -7397,7 +7571,7 @@
         <w:t xml:space="preserve">2.4 Matrix multiplication</w:t>
       </w:r>
     </w:p>
-    <w:bookmarkStart w:id="44" w:name="def-matrix-mult"/>
+    <w:bookmarkStart w:id="49" w:name="def-matrix-mult"/>
     <w:p>
       <w:pPr>
         <w:pStyle w:val="FirstParagraph"/>
@@ -7665,7 +7839,7 @@
         </m:oMath>
       </m:oMathPara>
     </w:p>
-    <w:bookmarkEnd w:id="44"/>
+    <w:bookmarkEnd w:id="49"/>
     <w:p>
       <w:pPr>
         <w:pStyle w:val="FirstParagraph"/>
@@ -7767,7 +7941,7 @@
         <w:t xml:space="preserve">.</w:t>
       </w:r>
     </w:p>
-    <w:bookmarkStart w:id="45" w:name="exm-dot-product-matmul"/>
+    <w:bookmarkStart w:id="50" w:name="exm-dot-product-matmul"/>
     <w:p>
       <w:pPr>
         <w:pStyle w:val="BodyText"/>
@@ -8246,8 +8420,8 @@
         </m:oMath>
       </m:oMathPara>
     </w:p>
-    <w:bookmarkEnd w:id="45"/>
-    <w:bookmarkStart w:id="46" w:name="thm-matmul-assoc"/>
+    <w:bookmarkEnd w:id="50"/>
+    <w:bookmarkStart w:id="51" w:name="thm-matmul-assoc"/>
     <w:p>
       <w:pPr>
         <w:pStyle w:val="FirstParagraph"/>
@@ -8527,7 +8701,7 @@
         </m:oMath>
       </m:oMathPara>
     </w:p>
-    <w:bookmarkEnd w:id="46"/>
+    <w:bookmarkEnd w:id="51"/>
     <w:p>
       <w:pPr>
         <w:pStyle w:val="FirstParagraph"/>
@@ -9367,7 +9541,7 @@
         </m:oMath>
       </m:oMathPara>
     </w:p>
-    <w:bookmarkStart w:id="47" w:name="thm-matmul-distrib"/>
+    <w:bookmarkStart w:id="52" w:name="thm-matmul-distrib"/>
     <w:p>
       <w:pPr>
         <w:pStyle w:val="FirstParagraph"/>
@@ -9750,9 +9924,9 @@
         </m:oMath>
       </m:oMathPara>
     </w:p>
-    <w:bookmarkEnd w:id="47"/>
-    <w:bookmarkEnd w:id="48"/>
-    <w:bookmarkStart w:id="50" w:name="matrix-vector-multiplication"/>
+    <w:bookmarkEnd w:id="52"/>
+    <w:bookmarkEnd w:id="53"/>
+    <w:bookmarkStart w:id="55" w:name="matrix-vector-multiplication"/>
     <w:p>
       <w:pPr>
         <w:pStyle w:val="Heading3"/>
@@ -9761,7 +9935,7 @@
         <w:t xml:space="preserve">2.5 Matrix-vector multiplication</w:t>
       </w:r>
     </w:p>
-    <w:bookmarkStart w:id="49" w:name="def-matvec-mult"/>
+    <w:bookmarkStart w:id="54" w:name="def-matvec-mult"/>
     <w:p>
       <w:pPr>
         <w:pStyle w:val="FirstParagraph"/>
@@ -10044,7 +10218,7 @@
         </m:oMath>
       </m:oMathPara>
     </w:p>
-    <w:bookmarkEnd w:id="49"/>
+    <w:bookmarkEnd w:id="54"/>
     <w:p>
       <w:pPr>
         <w:pStyle w:val="FirstParagraph"/>
@@ -10094,8 +10268,8 @@
         <w:t xml:space="preserve">.</w:t>
       </w:r>
     </w:p>
-    <w:bookmarkEnd w:id="50"/>
-    <w:bookmarkStart w:id="53" w:name="transposes-of-sums-and-products"/>
+    <w:bookmarkEnd w:id="55"/>
+    <w:bookmarkStart w:id="58" w:name="transposes-of-sums-and-products"/>
     <w:p>
       <w:pPr>
         <w:pStyle w:val="Heading3"/>
@@ -10104,7 +10278,7 @@
         <w:t xml:space="preserve">2.6 Transposes of sums and products</w:t>
       </w:r>
     </w:p>
-    <w:bookmarkStart w:id="51" w:name="thm-transpose-sum"/>
+    <w:bookmarkStart w:id="56" w:name="thm-transpose-sum"/>
     <w:p>
       <w:pPr>
         <w:pStyle w:val="FirstParagraph"/>
@@ -10447,7 +10621,7 @@
         </m:oMath>
       </m:oMathPara>
     </w:p>
-    <w:bookmarkEnd w:id="51"/>
+    <w:bookmarkEnd w:id="56"/>
     <w:p>
       <w:pPr>
         <w:pStyle w:val="FirstParagraph"/>
@@ -10919,7 +11093,7 @@
         </m:oMath>
       </m:oMathPara>
     </w:p>
-    <w:bookmarkStart w:id="52" w:name="thm-transpose-product"/>
+    <w:bookmarkStart w:id="57" w:name="thm-transpose-product"/>
     <w:p>
       <w:pPr>
         <w:pStyle w:val="FirstParagraph"/>
@@ -11198,7 +11372,7 @@
         </m:oMath>
       </m:oMathPara>
     </w:p>
-    <w:bookmarkEnd w:id="52"/>
+    <w:bookmarkEnd w:id="57"/>
     <w:p>
       <w:pPr>
         <w:pStyle w:val="FirstParagraph"/>
@@ -11715,8 +11889,8 @@
         <w:t xml:space="preserve">The order of the factors reverses when transposing a product.</w:t>
       </w:r>
     </w:p>
-    <w:bookmarkEnd w:id="53"/>
-    <w:bookmarkStart w:id="58" w:name="rank"/>
+    <w:bookmarkEnd w:id="58"/>
+    <w:bookmarkStart w:id="63" w:name="rank"/>
     <w:p>
       <w:pPr>
         <w:pStyle w:val="Heading3"/>
@@ -11725,7 +11899,7 @@
         <w:t xml:space="preserve">2.7 Rank</w:t>
       </w:r>
     </w:p>
-    <w:bookmarkStart w:id="54" w:name="def-linearly-independent"/>
+    <w:bookmarkStart w:id="59" w:name="def-linearly-independent"/>
     <w:p>
       <w:pPr>
         <w:pStyle w:val="FirstParagraph"/>
@@ -12069,8 +12243,8 @@
         <w:t xml:space="preserve">.</w:t>
       </w:r>
     </w:p>
-    <w:bookmarkEnd w:id="54"/>
-    <w:bookmarkStart w:id="55" w:name="exm-linearly-independent"/>
+    <w:bookmarkEnd w:id="59"/>
+    <w:bookmarkStart w:id="60" w:name="exm-linearly-independent"/>
     <w:p>
       <w:pPr>
         <w:pStyle w:val="BodyText"/>
@@ -12642,8 +12816,8 @@
         <w:t xml:space="preserve">.</w:t>
       </w:r>
     </w:p>
-    <w:bookmarkEnd w:id="55"/>
-    <w:bookmarkStart w:id="56" w:name="def-rank"/>
+    <w:bookmarkEnd w:id="60"/>
+    <w:bookmarkStart w:id="61" w:name="def-rank"/>
     <w:p>
       <w:pPr>
         <w:pStyle w:val="FirstParagraph"/>
@@ -12758,7 +12932,7 @@
         <w:t xml:space="preserve">).</w:t>
       </w:r>
     </w:p>
-    <w:bookmarkEnd w:id="56"/>
+    <w:bookmarkEnd w:id="61"/>
     <w:p>
       <w:pPr>
         <w:pStyle w:val="BodyText"/>
@@ -12886,7 +13060,7 @@
         <w:t xml:space="preserve">are never linearly independent.</w:t>
       </w:r>
     </w:p>
-    <w:bookmarkStart w:id="57" w:name="exm-rank"/>
+    <w:bookmarkStart w:id="62" w:name="exm-rank"/>
     <w:p>
       <w:pPr>
         <w:pStyle w:val="BodyText"/>
@@ -13338,9 +13512,9 @@
         <w:t xml:space="preserve">but the first column on its own is.</w:t>
       </w:r>
     </w:p>
-    <w:bookmarkEnd w:id="57"/>
-    <w:bookmarkEnd w:id="58"/>
-    <w:bookmarkStart w:id="63" w:name="outer-product"/>
+    <w:bookmarkEnd w:id="62"/>
+    <w:bookmarkEnd w:id="63"/>
+    <w:bookmarkStart w:id="68" w:name="outer-product"/>
     <w:p>
       <w:pPr>
         <w:pStyle w:val="Heading3"/>
@@ -13349,7 +13523,7 @@
         <w:t xml:space="preserve">2.8 Outer product</w:t>
       </w:r>
     </w:p>
-    <w:bookmarkStart w:id="59" w:name="def-outer-product"/>
+    <w:bookmarkStart w:id="64" w:name="def-outer-product"/>
     <w:p>
       <w:pPr>
         <w:pStyle w:val="FirstParagraph"/>
@@ -13766,7 +13940,7 @@
         </m:oMath>
       </m:oMathPara>
     </w:p>
-    <w:bookmarkEnd w:id="59"/>
+    <w:bookmarkEnd w:id="64"/>
     <w:p>
       <w:pPr>
         <w:pStyle w:val="FirstParagraph"/>
@@ -13896,7 +14070,7 @@
         <w:t xml:space="preserve">.</w:t>
       </w:r>
     </w:p>
-    <w:bookmarkStart w:id="60" w:name="exm-outer-product"/>
+    <w:bookmarkStart w:id="65" w:name="exm-outer-product"/>
     <w:p>
       <w:pPr>
         <w:pStyle w:val="BodyText"/>
@@ -14479,8 +14653,8 @@
         </m:oMath>
       </m:oMathPara>
     </w:p>
-    <w:bookmarkEnd w:id="60"/>
-    <w:bookmarkStart w:id="61" w:name="thm-outer-product-rank"/>
+    <w:bookmarkEnd w:id="65"/>
+    <w:bookmarkStart w:id="66" w:name="thm-outer-product-rank"/>
     <w:p>
       <w:pPr>
         <w:pStyle w:val="FirstParagraph"/>
@@ -14656,7 +14830,7 @@
         <w:t xml:space="preserve">).</w:t>
       </w:r>
     </w:p>
-    <w:bookmarkEnd w:id="61"/>
+    <w:bookmarkEnd w:id="66"/>
     <w:p>
       <w:pPr>
         <w:pStyle w:val="BodyText"/>
@@ -15899,7 +16073,7 @@
         <w:t xml:space="preserve">The largest linearly independent set of columns therefore has one column.</w:t>
       </w:r>
     </w:p>
-    <w:bookmarkStart w:id="62" w:name="exm-outer-product-rank"/>
+    <w:bookmarkStart w:id="67" w:name="exm-outer-product-rank"/>
     <w:p>
       <w:pPr>
         <w:pStyle w:val="BodyText"/>
@@ -16248,10 +16422,10 @@
         <w:t xml:space="preserve">.</w:t>
       </w:r>
     </w:p>
-    <w:bookmarkEnd w:id="62"/>
-    <w:bookmarkEnd w:id="63"/>
-    <w:bookmarkEnd w:id="64"/>
-    <w:bookmarkStart w:id="89" w:name="special-matrices"/>
+    <w:bookmarkEnd w:id="67"/>
+    <w:bookmarkEnd w:id="68"/>
+    <w:bookmarkEnd w:id="69"/>
+    <w:bookmarkStart w:id="94" w:name="special-matrices"/>
     <w:p>
       <w:pPr>
         <w:pStyle w:val="Heading2"/>
@@ -16285,7 +16459,7 @@
         <w:t xml:space="preserve">for the zero matrix.</w:t>
       </w:r>
     </w:p>
-    <w:bookmarkStart w:id="65" w:name="def-square-matrix"/>
+    <w:bookmarkStart w:id="70" w:name="def-square-matrix"/>
     <w:p>
       <w:pPr>
         <w:pStyle w:val="BodyText"/>
@@ -16320,8 +16494,8 @@
         <w:t xml:space="preserve">if it has the same number of rows as columns.</w:t>
       </w:r>
     </w:p>
-    <w:bookmarkEnd w:id="65"/>
-    <w:bookmarkStart w:id="66" w:name="def-matrix-order"/>
+    <w:bookmarkEnd w:id="70"/>
+    <w:bookmarkStart w:id="71" w:name="def-matrix-order"/>
     <w:p>
       <w:pPr>
         <w:pStyle w:val="BodyText"/>
@@ -16373,8 +16547,8 @@
         <w:t xml:space="preserve">is its number of rows, which equals its number of columns.</w:t>
       </w:r>
     </w:p>
-    <w:bookmarkEnd w:id="66"/>
-    <w:bookmarkStart w:id="67" w:name="def-matrix-power"/>
+    <w:bookmarkEnd w:id="71"/>
+    <w:bookmarkStart w:id="72" w:name="def-matrix-power"/>
     <w:p>
       <w:pPr>
         <w:pStyle w:val="BodyText"/>
@@ -16622,8 +16796,8 @@
         <w:t xml:space="preserve">.</w:t>
       </w:r>
     </w:p>
-    <w:bookmarkEnd w:id="67"/>
-    <w:bookmarkStart w:id="68" w:name="def-identity-matrix"/>
+    <w:bookmarkEnd w:id="72"/>
+    <w:bookmarkStart w:id="73" w:name="def-identity-matrix"/>
     <w:p>
       <w:pPr>
         <w:pStyle w:val="BodyText"/>
@@ -17036,8 +17210,8 @@
         </m:oMath>
       </m:oMathPara>
     </w:p>
-    <w:bookmarkEnd w:id="68"/>
-    <w:bookmarkStart w:id="69" w:name="thm-identity"/>
+    <w:bookmarkEnd w:id="73"/>
+    <w:bookmarkStart w:id="74" w:name="thm-identity"/>
     <w:p>
       <w:pPr>
         <w:pStyle w:val="FirstParagraph"/>
@@ -17189,8 +17363,8 @@
         </m:oMath>
       </m:oMathPara>
     </w:p>
-    <w:bookmarkEnd w:id="69"/>
-    <w:bookmarkStart w:id="70" w:name="def-symmetric-matrix"/>
+    <w:bookmarkEnd w:id="74"/>
+    <w:bookmarkStart w:id="75" w:name="def-symmetric-matrix"/>
     <w:p>
       <w:pPr>
         <w:pStyle w:val="FirstParagraph"/>
@@ -17358,7 +17532,7 @@
         <w:t xml:space="preserve">.</w:t>
       </w:r>
     </w:p>
-    <w:bookmarkEnd w:id="70"/>
+    <w:bookmarkEnd w:id="75"/>
     <w:p>
       <w:pPr>
         <w:pStyle w:val="BodyText"/>
@@ -17367,7 +17541,7 @@
         <w:t xml:space="preserve">Covariance matrices and information matrices are symmetric.</w:t>
       </w:r>
     </w:p>
-    <w:bookmarkStart w:id="71" w:name="def-diagonal-matrix"/>
+    <w:bookmarkStart w:id="76" w:name="def-diagonal-matrix"/>
     <w:p>
       <w:pPr>
         <w:pStyle w:val="BodyText"/>
@@ -17676,7 +17850,7 @@
         </m:oMath>
       </m:oMathPara>
     </w:p>
-    <w:bookmarkEnd w:id="71"/>
+    <w:bookmarkEnd w:id="76"/>
     <w:p>
       <w:pPr>
         <w:pStyle w:val="FirstParagraph"/>
@@ -17843,7 +18017,7 @@
         <w:t xml:space="preserve">are the diagonal entries.</w:t>
       </w:r>
     </w:p>
-    <w:bookmarkStart w:id="72" w:name="def-matrix-inverse"/>
+    <w:bookmarkStart w:id="77" w:name="def-matrix-inverse"/>
     <w:p>
       <w:pPr>
         <w:pStyle w:val="BodyText"/>
@@ -18046,8 +18220,8 @@
         </m:oMath>
       </m:oMathPara>
     </w:p>
-    <w:bookmarkEnd w:id="72"/>
-    <w:bookmarkStart w:id="73" w:name="def-invertible-matrix"/>
+    <w:bookmarkEnd w:id="77"/>
+    <w:bookmarkStart w:id="78" w:name="def-invertible-matrix"/>
     <w:p>
       <w:pPr>
         <w:pStyle w:val="FirstParagraph"/>
@@ -18180,8 +18354,8 @@
         <w:t xml:space="preserve">.</w:t>
       </w:r>
     </w:p>
-    <w:bookmarkEnd w:id="73"/>
-    <w:bookmarkStart w:id="74" w:name="exm-invertible-matrix"/>
+    <w:bookmarkEnd w:id="78"/>
+    <w:bookmarkStart w:id="79" w:name="exm-invertible-matrix"/>
     <w:p>
       <w:pPr>
         <w:pStyle w:val="BodyText"/>
@@ -18682,8 +18856,8 @@
         <w:t xml:space="preserve">whose two rows differ.</w:t>
       </w:r>
     </w:p>
-    <w:bookmarkEnd w:id="74"/>
-    <w:bookmarkStart w:id="75" w:name="thm-inverse-product"/>
+    <w:bookmarkEnd w:id="79"/>
+    <w:bookmarkStart w:id="80" w:name="thm-inverse-product"/>
     <w:p>
       <w:pPr>
         <w:pStyle w:val="BodyText"/>
@@ -18887,7 +19061,7 @@
         </m:oMath>
       </m:oMathPara>
     </w:p>
-    <w:bookmarkEnd w:id="75"/>
+    <w:bookmarkEnd w:id="80"/>
     <w:p>
       <w:pPr>
         <w:pStyle w:val="FirstParagraph"/>
@@ -19872,7 +20046,7 @@
         <w:t xml:space="preserve">.</w:t>
       </w:r>
     </w:p>
-    <w:bookmarkStart w:id="76" w:name="thm-inverse-transpose"/>
+    <w:bookmarkStart w:id="81" w:name="thm-inverse-transpose"/>
     <w:p>
       <w:pPr>
         <w:pStyle w:val="BodyText"/>
@@ -20082,7 +20256,7 @@
         </m:oMath>
       </m:oMathPara>
     </w:p>
-    <w:bookmarkEnd w:id="76"/>
+    <w:bookmarkEnd w:id="81"/>
     <w:p>
       <w:pPr>
         <w:pStyle w:val="FirstParagraph"/>
@@ -20867,7 +21041,7 @@
         <w:t xml:space="preserve">.</w:t>
       </w:r>
     </w:p>
-    <w:bookmarkStart w:id="77" w:name="exm-inverse-transpose"/>
+    <w:bookmarkStart w:id="82" w:name="exm-inverse-transpose"/>
     <w:p>
       <w:pPr>
         <w:pStyle w:val="BodyText"/>
@@ -21530,8 +21704,8 @@
         <w:t xml:space="preserve">.</w:t>
       </w:r>
     </w:p>
-    <w:bookmarkEnd w:id="77"/>
-    <w:bookmarkStart w:id="78" w:name="cor-inverse-symmetric"/>
+    <w:bookmarkEnd w:id="82"/>
+    <w:bookmarkStart w:id="83" w:name="cor-inverse-symmetric"/>
     <w:p>
       <w:pPr>
         <w:pStyle w:val="BodyText"/>
@@ -21599,7 +21773,7 @@
         <w:t xml:space="preserve">is symmetric.</w:t>
       </w:r>
     </w:p>
-    <w:bookmarkEnd w:id="78"/>
+    <w:bookmarkEnd w:id="83"/>
     <w:p>
       <w:pPr>
         <w:pStyle w:val="BodyText"/>
@@ -21831,7 +22005,7 @@
         <w:t xml:space="preserve">.</w:t>
       </w:r>
     </w:p>
-    <w:bookmarkStart w:id="79" w:name="exm-inverse-symmetric"/>
+    <w:bookmarkStart w:id="84" w:name="exm-inverse-symmetric"/>
     <w:p>
       <w:pPr>
         <w:pStyle w:val="BodyText"/>
@@ -22048,8 +22222,8 @@
         <w:t xml:space="preserve">says.</w:t>
       </w:r>
     </w:p>
-    <w:bookmarkEnd w:id="79"/>
-    <w:bookmarkStart w:id="80" w:name="def-idempotent-matrix"/>
+    <w:bookmarkEnd w:id="84"/>
+    <w:bookmarkStart w:id="85" w:name="def-idempotent-matrix"/>
     <w:p>
       <w:pPr>
         <w:pStyle w:val="BodyText"/>
@@ -22140,8 +22314,8 @@
         </m:oMath>
       </m:oMathPara>
     </w:p>
-    <w:bookmarkEnd w:id="80"/>
-    <w:bookmarkStart w:id="81" w:name="def-projection-matrix"/>
+    <w:bookmarkEnd w:id="85"/>
+    <w:bookmarkStart w:id="86" w:name="def-projection-matrix"/>
     <w:p>
       <w:pPr>
         <w:pStyle w:val="FirstParagraph"/>
@@ -22303,7 +22477,7 @@
         </m:oMath>
       </m:oMathPara>
     </w:p>
-    <w:bookmarkEnd w:id="81"/>
+    <w:bookmarkEnd w:id="86"/>
     <w:p>
       <w:pPr>
         <w:pStyle w:val="FirstParagraph"/>
@@ -22403,7 +22577,7 @@
         <w:t xml:space="preserve">.</w:t>
       </w:r>
     </w:p>
-    <w:bookmarkStart w:id="82" w:name="exm-projection-matrix"/>
+    <w:bookmarkStart w:id="87" w:name="exm-projection-matrix"/>
     <w:p>
       <w:pPr>
         <w:pStyle w:val="BodyText"/>
@@ -23078,8 +23252,8 @@
         <w:t xml:space="preserve">not an orthogonal projection matrix.</w:t>
       </w:r>
     </w:p>
-    <w:bookmarkEnd w:id="82"/>
-    <w:bookmarkStart w:id="83" w:name="thm-projection-complement"/>
+    <w:bookmarkEnd w:id="87"/>
+    <w:bookmarkStart w:id="88" w:name="thm-projection-complement"/>
     <w:p>
       <w:pPr>
         <w:pStyle w:val="BodyText"/>
@@ -23193,7 +23367,7 @@
         <w:t xml:space="preserve">is also an orthogonal projection matrix.</w:t>
       </w:r>
     </w:p>
-    <w:bookmarkEnd w:id="83"/>
+    <w:bookmarkEnd w:id="88"/>
     <w:p>
       <w:pPr>
         <w:pStyle w:val="BodyText"/>
@@ -23630,7 +23804,7 @@
         </m:oMath>
       </m:oMathPara>
     </w:p>
-    <w:bookmarkStart w:id="84" w:name="thm-projection-orthogonal"/>
+    <w:bookmarkStart w:id="89" w:name="thm-projection-orthogonal"/>
     <w:p>
       <w:pPr>
         <w:pStyle w:val="FirstParagraph"/>
@@ -23990,7 +24164,7 @@
         </m:oMath>
       </m:oMathPara>
     </w:p>
-    <w:bookmarkEnd w:id="84"/>
+    <w:bookmarkEnd w:id="89"/>
     <w:p>
       <w:pPr>
         <w:pStyle w:val="FirstParagraph"/>
@@ -24596,7 +24770,7 @@
         <w:t xml:space="preserve">).</w:t>
       </w:r>
     </w:p>
-    <w:bookmarkStart w:id="85" w:name="def-orthogonal-matrix"/>
+    <w:bookmarkStart w:id="90" w:name="def-orthogonal-matrix"/>
     <w:p>
       <w:pPr>
         <w:pStyle w:val="BodyText"/>
@@ -24791,7 +24965,7 @@
         </m:oMath>
       </m:oMathPara>
     </w:p>
-    <w:bookmarkEnd w:id="85"/>
+    <w:bookmarkEnd w:id="90"/>
     <w:p>
       <w:pPr>
         <w:pStyle w:val="FirstParagraph"/>
@@ -25211,7 +25385,7 @@
         <w:t xml:space="preserve">.</w:t>
       </w:r>
     </w:p>
-    <w:bookmarkStart w:id="86" w:name="exm-orthogonal-matrix"/>
+    <w:bookmarkStart w:id="91" w:name="exm-orthogonal-matrix"/>
     <w:p>
       <w:pPr>
         <w:pStyle w:val="BodyText"/>
@@ -25815,8 +25989,8 @@
         </m:oMath>
       </m:oMathPara>
     </w:p>
-    <w:bookmarkEnd w:id="86"/>
-    <w:bookmarkStart w:id="87" w:name="thm-orthogonal-norm"/>
+    <w:bookmarkEnd w:id="91"/>
+    <w:bookmarkStart w:id="92" w:name="thm-orthogonal-norm"/>
     <w:p>
       <w:pPr>
         <w:pStyle w:val="FirstParagraph"/>
@@ -26000,7 +26174,7 @@
         </m:oMath>
       </m:oMathPara>
     </w:p>
-    <w:bookmarkEnd w:id="87"/>
+    <w:bookmarkEnd w:id="92"/>
     <w:p>
       <w:pPr>
         <w:pStyle w:val="FirstParagraph"/>
@@ -26789,7 +26963,7 @@
         <w:t xml:space="preserve">.</w:t>
       </w:r>
     </w:p>
-    <w:bookmarkStart w:id="88" w:name="exm-orthogonal-norm"/>
+    <w:bookmarkStart w:id="93" w:name="exm-orthogonal-norm"/>
     <w:p>
       <w:pPr>
         <w:pStyle w:val="BodyText"/>
@@ -27484,9 +27658,9 @@
         <w:t xml:space="preserve">.</w:t>
       </w:r>
     </w:p>
-    <w:bookmarkEnd w:id="88"/>
-    <w:bookmarkEnd w:id="89"/>
-    <w:bookmarkStart w:id="97" w:name="quadratic-forms"/>
+    <w:bookmarkEnd w:id="93"/>
+    <w:bookmarkEnd w:id="94"/>
+    <w:bookmarkStart w:id="102" w:name="quadratic-forms"/>
     <w:p>
       <w:pPr>
         <w:pStyle w:val="Heading2"/>
@@ -27495,7 +27669,7 @@
         <w:t xml:space="preserve">4 Quadratic Forms</w:t>
       </w:r>
     </w:p>
-    <w:bookmarkStart w:id="90" w:name="def-quadratic-form"/>
+    <w:bookmarkStart w:id="95" w:name="def-quadratic-form"/>
     <w:p>
       <w:pPr>
         <w:pStyle w:val="FirstParagraph"/>
@@ -27684,7 +27858,7 @@
         <w:t xml:space="preserve">matrix.</w:t>
       </w:r>
     </w:p>
-    <w:bookmarkEnd w:id="90"/>
+    <w:bookmarkEnd w:id="95"/>
     <w:p>
       <w:pPr>
         <w:pStyle w:val="BodyText"/>
@@ -27742,7 +27916,7 @@
       <w:r>
         <w:t xml:space="preserve"> </w:t>
       </w:r>
-      <w:hyperlink r:id="rId91">
+      <w:hyperlink r:id="rId96">
         <w:r>
           <w:rPr>
             <w:rStyle w:val="Hyperlink"/>
@@ -27780,7 +27954,7 @@
       <w:r>
         <w:t xml:space="preserve"> </w:t>
       </w:r>
-      <w:hyperlink r:id="rId92">
+      <w:hyperlink r:id="rId97">
         <w:r>
           <w:rPr>
             <w:rStyle w:val="Hyperlink"/>
@@ -27950,7 +28124,7 @@
         <w:t xml:space="preserve">.</w:t>
       </w:r>
     </w:p>
-    <w:bookmarkStart w:id="93" w:name="def-symmetric-part"/>
+    <w:bookmarkStart w:id="98" w:name="def-symmetric-part"/>
     <w:p>
       <w:pPr>
         <w:pStyle w:val="FirstParagraph"/>
@@ -28098,8 +28272,8 @@
         </m:oMath>
       </m:oMathPara>
     </w:p>
-    <w:bookmarkEnd w:id="93"/>
-    <w:bookmarkStart w:id="94" w:name="exm-symmetric-part"/>
+    <w:bookmarkEnd w:id="98"/>
+    <w:bookmarkStart w:id="99" w:name="exm-symmetric-part"/>
     <w:p>
       <w:pPr>
         <w:pStyle w:val="FirstParagraph"/>
@@ -28539,8 +28713,8 @@
         <w:t xml:space="preserve">which is symmetric.</w:t>
       </w:r>
     </w:p>
-    <w:bookmarkEnd w:id="94"/>
-    <w:bookmarkStart w:id="95" w:name="thm-quadratic-form-symmetric"/>
+    <w:bookmarkEnd w:id="99"/>
+    <w:bookmarkStart w:id="100" w:name="thm-quadratic-form-symmetric"/>
     <w:p>
       <w:pPr>
         <w:pStyle w:val="BodyText"/>
@@ -28831,7 +29005,7 @@
         <w:t xml:space="preserve">.</w:t>
       </w:r>
     </w:p>
-    <w:bookmarkEnd w:id="95"/>
+    <w:bookmarkEnd w:id="100"/>
     <w:p>
       <w:pPr>
         <w:pStyle w:val="BodyText"/>
@@ -29857,7 +30031,7 @@
         <w:t xml:space="preserve">.</w:t>
       </w:r>
     </w:p>
-    <w:bookmarkStart w:id="96" w:name="exm-quadratic-form-symmetric"/>
+    <w:bookmarkStart w:id="101" w:name="exm-quadratic-form-symmetric"/>
     <w:p>
       <w:pPr>
         <w:pStyle w:val="BodyText"/>
@@ -30293,9 +30467,9 @@
         <w:t xml:space="preserve">.</w:t>
       </w:r>
     </w:p>
-    <w:bookmarkEnd w:id="96"/>
-    <w:bookmarkEnd w:id="97"/>
-    <w:bookmarkStart w:id="107" w:name="trace-and-matrix-inner-product"/>
+    <w:bookmarkEnd w:id="101"/>
+    <w:bookmarkEnd w:id="102"/>
+    <w:bookmarkStart w:id="112" w:name="trace-and-matrix-inner-product"/>
     <w:p>
       <w:pPr>
         <w:pStyle w:val="Heading2"/>
@@ -30304,7 +30478,7 @@
         <w:t xml:space="preserve">5 Trace and Matrix Inner Product</w:t>
       </w:r>
     </w:p>
-    <w:bookmarkStart w:id="98" w:name="def-trace"/>
+    <w:bookmarkStart w:id="103" w:name="def-trace"/>
     <w:p>
       <w:pPr>
         <w:pStyle w:val="FirstParagraph"/>
@@ -30478,8 +30652,8 @@
         </m:oMath>
       </m:oMathPara>
     </w:p>
-    <w:bookmarkEnd w:id="98"/>
-    <w:bookmarkStart w:id="99" w:name="exm-trace"/>
+    <w:bookmarkEnd w:id="103"/>
+    <w:bookmarkStart w:id="104" w:name="exm-trace"/>
     <w:p>
       <w:pPr>
         <w:pStyle w:val="FirstParagraph"/>
@@ -30642,8 +30816,8 @@
         </m:oMath>
       </m:oMathPara>
     </w:p>
-    <w:bookmarkEnd w:id="99"/>
-    <w:bookmarkStart w:id="100" w:name="thm-trace-cyclic"/>
+    <w:bookmarkEnd w:id="104"/>
+    <w:bookmarkStart w:id="105" w:name="thm-trace-cyclic"/>
     <w:p>
       <w:pPr>
         <w:pStyle w:val="FirstParagraph"/>
@@ -30885,7 +31059,7 @@
         </m:oMath>
       </m:oMathPara>
     </w:p>
-    <w:bookmarkEnd w:id="100"/>
+    <w:bookmarkEnd w:id="105"/>
     <w:p>
       <w:pPr>
         <w:pStyle w:val="FirstParagraph"/>
@@ -31783,7 +31957,7 @@
         <w:t xml:space="preserve">.</w:t>
       </w:r>
     </w:p>
-    <w:bookmarkStart w:id="101" w:name="exm-trace-cyclic"/>
+    <w:bookmarkStart w:id="106" w:name="exm-trace-cyclic"/>
     <w:p>
       <w:pPr>
         <w:pStyle w:val="BodyText"/>
@@ -33327,8 +33501,8 @@
         <w:t xml:space="preserve">The products have different sizes, but their traces agree.</w:t>
       </w:r>
     </w:p>
-    <w:bookmarkEnd w:id="101"/>
-    <w:bookmarkStart w:id="102" w:name="def-matrix-inner-product"/>
+    <w:bookmarkEnd w:id="106"/>
+    <w:bookmarkStart w:id="107" w:name="def-matrix-inner-product"/>
     <w:p>
       <w:pPr>
         <w:pStyle w:val="BodyText"/>
@@ -33555,7 +33729,7 @@
         </m:oMath>
       </m:oMathPara>
     </w:p>
-    <w:bookmarkEnd w:id="102"/>
+    <w:bookmarkEnd w:id="107"/>
     <w:p>
       <w:pPr>
         <w:pStyle w:val="FirstParagraph"/>
@@ -33593,7 +33767,7 @@
         <w:t xml:space="preserve">matrices with the trace.</w:t>
       </w:r>
     </w:p>
-    <w:bookmarkStart w:id="103" w:name="thm-matrix-inner-product-entries"/>
+    <w:bookmarkStart w:id="108" w:name="thm-matrix-inner-product-entries"/>
     <w:p>
       <w:pPr>
         <w:pStyle w:val="BodyText"/>
@@ -33803,7 +33977,7 @@
         </m:oMath>
       </m:oMathPara>
     </w:p>
-    <w:bookmarkEnd w:id="103"/>
+    <w:bookmarkEnd w:id="108"/>
     <w:p>
       <w:pPr>
         <w:pStyle w:val="FirstParagraph"/>
@@ -34456,7 +34630,7 @@
         <w:t xml:space="preserve">.</w:t>
       </w:r>
     </w:p>
-    <w:bookmarkStart w:id="104" w:name="exm-matrix-inner-product"/>
+    <w:bookmarkStart w:id="109" w:name="exm-matrix-inner-product"/>
     <w:p>
       <w:pPr>
         <w:pStyle w:val="BodyText"/>
@@ -35563,8 +35737,8 @@
         </m:oMath>
       </m:oMathPara>
     </w:p>
-    <w:bookmarkEnd w:id="104"/>
-    <w:bookmarkStart w:id="105" w:name="def-frobenius-norm"/>
+    <w:bookmarkEnd w:id="109"/>
+    <w:bookmarkStart w:id="110" w:name="def-frobenius-norm"/>
     <w:p>
       <w:pPr>
         <w:pStyle w:val="FirstParagraph"/>
@@ -35801,7 +35975,7 @@
         <w:t xml:space="preserve">).</w:t>
       </w:r>
     </w:p>
-    <w:bookmarkEnd w:id="105"/>
+    <w:bookmarkEnd w:id="110"/>
     <w:p>
       <w:pPr>
         <w:pStyle w:val="BodyText"/>
@@ -36051,7 +36225,7 @@
         <w:t xml:space="preserve">.</w:t>
       </w:r>
     </w:p>
-    <w:bookmarkStart w:id="106" w:name="exm-frobenius-norm"/>
+    <w:bookmarkStart w:id="111" w:name="exm-frobenius-norm"/>
     <w:p>
       <w:pPr>
         <w:pStyle w:val="BodyText"/>
@@ -36501,9 +36675,9 @@
         <w:t xml:space="preserve">.</w:t>
       </w:r>
     </w:p>
-    <w:bookmarkEnd w:id="106"/>
-    <w:bookmarkEnd w:id="107"/>
-    <w:bookmarkStart w:id="119" w:name="matrix-decompositions"/>
+    <w:bookmarkEnd w:id="111"/>
+    <w:bookmarkEnd w:id="112"/>
+    <w:bookmarkStart w:id="124" w:name="matrix-decompositions"/>
     <w:p>
       <w:pPr>
         <w:pStyle w:val="Heading2"/>
@@ -36512,7 +36686,7 @@
         <w:t xml:space="preserve">6 Matrix Decompositions</w:t>
       </w:r>
     </w:p>
-    <w:bookmarkStart w:id="108" w:name="def-eigenvalue"/>
+    <w:bookmarkStart w:id="113" w:name="def-eigenvalue"/>
     <w:p>
       <w:pPr>
         <w:pStyle w:val="FirstParagraph"/>
@@ -36891,7 +37065,7 @@
         <w:t xml:space="preserve">.</w:t>
       </w:r>
     </w:p>
-    <w:bookmarkEnd w:id="108"/>
+    <w:bookmarkEnd w:id="113"/>
     <w:p>
       <w:pPr>
         <w:pStyle w:val="BodyText"/>
@@ -37212,7 +37386,7 @@
         <w:t xml:space="preserve">.</w:t>
       </w:r>
     </w:p>
-    <w:bookmarkStart w:id="109" w:name="exm-eigenvalue"/>
+    <w:bookmarkStart w:id="114" w:name="exm-eigenvalue"/>
     <w:p>
       <w:pPr>
         <w:pStyle w:val="BodyText"/>
@@ -37976,8 +38150,8 @@
         </m:oMath>
       </m:oMathPara>
     </w:p>
-    <w:bookmarkEnd w:id="109"/>
-    <w:bookmarkStart w:id="110" w:name="exm-not-eigenvector"/>
+    <w:bookmarkEnd w:id="114"/>
+    <w:bookmarkStart w:id="115" w:name="exm-not-eigenvector"/>
     <w:p>
       <w:pPr>
         <w:pStyle w:val="FirstParagraph"/>
@@ -38324,8 +38498,8 @@
         <w:t xml:space="preserve">.</w:t>
       </w:r>
     </w:p>
-    <w:bookmarkEnd w:id="110"/>
-    <w:bookmarkStart w:id="111" w:name="thm-spectral"/>
+    <w:bookmarkEnd w:id="115"/>
+    <w:bookmarkStart w:id="116" w:name="thm-spectral"/>
     <w:p>
       <w:pPr>
         <w:pStyle w:val="BodyText"/>
@@ -38887,7 +39061,7 @@
         <w:t xml:space="preserve">.</w:t>
       </w:r>
     </w:p>
-    <w:bookmarkEnd w:id="111"/>
+    <w:bookmarkEnd w:id="116"/>
     <w:p>
       <w:pPr>
         <w:pStyle w:val="BodyText"/>
@@ -39172,7 +39346,7 @@
         <w:t xml:space="preserve">on the right.</w:t>
       </w:r>
     </w:p>
-    <w:bookmarkStart w:id="112" w:name="def-eigendecomposition"/>
+    <w:bookmarkStart w:id="117" w:name="def-eigendecomposition"/>
     <w:p>
       <w:pPr>
         <w:pStyle w:val="BodyText"/>
@@ -39484,7 +39658,7 @@
         <w:t xml:space="preserve">has one.</w:t>
       </w:r>
     </w:p>
-    <w:bookmarkEnd w:id="112"/>
+    <w:bookmarkEnd w:id="117"/>
     <w:p>
       <w:pPr>
         <w:pStyle w:val="BodyText"/>
@@ -39576,7 +39750,7 @@
         <w:t xml:space="preserve">.</w:t>
       </w:r>
     </w:p>
-    <w:bookmarkStart w:id="113" w:name="exm-spectral"/>
+    <w:bookmarkStart w:id="118" w:name="exm-spectral"/>
     <w:p>
       <w:pPr>
         <w:pStyle w:val="BodyText"/>
@@ -42470,8 +42644,8 @@
         <w:t xml:space="preserve">.</w:t>
       </w:r>
     </w:p>
-    <w:bookmarkEnd w:id="113"/>
-    <w:bookmarkStart w:id="114" w:name="thm-svd"/>
+    <w:bookmarkEnd w:id="118"/>
+    <w:bookmarkStart w:id="119" w:name="thm-svd"/>
     <w:p>
       <w:pPr>
         <w:pStyle w:val="BodyText"/>
@@ -43087,7 +43261,7 @@
         <w:t xml:space="preserve">.</w:t>
       </w:r>
     </w:p>
-    <w:bookmarkEnd w:id="114"/>
+    <w:bookmarkEnd w:id="119"/>
     <w:p>
       <w:pPr>
         <w:pStyle w:val="BodyText"/>
@@ -43151,7 +43325,7 @@
         <w:t xml:space="preserve">including one that is not square or not symmetric.</w:t>
       </w:r>
     </w:p>
-    <w:bookmarkStart w:id="115" w:name="def-svd"/>
+    <w:bookmarkStart w:id="120" w:name="def-svd"/>
     <w:p>
       <w:pPr>
         <w:pStyle w:val="BodyText"/>
@@ -43526,7 +43700,7 @@
         <w:t xml:space="preserve">.</w:t>
       </w:r>
     </w:p>
-    <w:bookmarkEnd w:id="115"/>
+    <w:bookmarkEnd w:id="120"/>
     <w:p>
       <w:pPr>
         <w:pStyle w:val="BodyText"/>
@@ -43816,7 +43990,7 @@
         <w:t xml:space="preserve">singular values.</w:t>
       </w:r>
     </w:p>
-    <w:bookmarkStart w:id="116" w:name="exm-svd"/>
+    <w:bookmarkStart w:id="121" w:name="exm-svd"/>
     <w:p>
       <w:pPr>
         <w:pStyle w:val="BodyText"/>
@@ -49212,8 +49386,8 @@
         <w:t xml:space="preserve">.</w:t>
       </w:r>
     </w:p>
-    <w:bookmarkEnd w:id="116"/>
-    <w:bookmarkStart w:id="117" w:name="thm-svd-evd"/>
+    <w:bookmarkEnd w:id="121"/>
+    <w:bookmarkStart w:id="122" w:name="thm-svd-evd"/>
     <w:p>
       <w:pPr>
         <w:pStyle w:val="BodyText"/>
@@ -50080,7 +50254,7 @@
         <w:t xml:space="preserve">.</w:t>
       </w:r>
     </w:p>
-    <w:bookmarkEnd w:id="117"/>
+    <w:bookmarkEnd w:id="122"/>
     <w:p>
       <w:pPr>
         <w:pStyle w:val="BodyText"/>
@@ -53356,7 +53530,7 @@
         <w:t xml:space="preserve">.</w:t>
       </w:r>
     </w:p>
-    <w:bookmarkStart w:id="118" w:name="exm-svd-evd"/>
+    <w:bookmarkStart w:id="123" w:name="exm-svd-evd"/>
     <w:p>
       <w:pPr>
         <w:pStyle w:val="BodyText"/>
@@ -54974,9 +55148,9 @@
         </m:oMath>
       </m:oMathPara>
     </w:p>
-    <w:bookmarkEnd w:id="118"/>
-    <w:bookmarkEnd w:id="119"/>
-    <w:bookmarkStart w:id="127" w:name="design-matrix"/>
+    <w:bookmarkEnd w:id="123"/>
+    <w:bookmarkEnd w:id="124"/>
+    <w:bookmarkStart w:id="132" w:name="design-matrix"/>
     <w:p>
       <w:pPr>
         <w:pStyle w:val="Heading2"/>
@@ -54985,7 +55159,7 @@
         <w:t xml:space="preserve">7 Design Matrix</w:t>
       </w:r>
     </w:p>
-    <w:bookmarkStart w:id="120" w:name="def-design-matrix"/>
+    <w:bookmarkStart w:id="125" w:name="def-design-matrix"/>
     <w:p>
       <w:pPr>
         <w:pStyle w:val="FirstParagraph"/>
@@ -55587,7 +55761,7 @@
         </m:oMath>
       </m:oMathPara>
     </w:p>
-    <w:bookmarkEnd w:id="120"/>
+    <w:bookmarkEnd w:id="125"/>
     <w:p>
       <w:pPr>
         <w:pStyle w:val="FirstParagraph"/>
@@ -56038,7 +56212,7 @@
         <w:t xml:space="preserve">.</w:t>
       </w:r>
     </w:p>
-    <w:bookmarkStart w:id="121" w:name="thm-gram-invertible"/>
+    <w:bookmarkStart w:id="126" w:name="thm-gram-invertible"/>
     <w:p>
       <w:pPr>
         <w:pStyle w:val="BodyText"/>
@@ -56285,7 +56459,7 @@
         <w:t xml:space="preserve">is invertible.</w:t>
       </w:r>
     </w:p>
-    <w:bookmarkEnd w:id="121"/>
+    <w:bookmarkEnd w:id="126"/>
     <w:p>
       <w:pPr>
         <w:pStyle w:val="BodyText"/>
@@ -57135,7 +57309,7 @@
         <w:t xml:space="preserve">.</w:t>
       </w:r>
     </w:p>
-    <w:bookmarkStart w:id="122" w:name="exm-gram-invertible"/>
+    <w:bookmarkStart w:id="127" w:name="exm-gram-invertible"/>
     <w:p>
       <w:pPr>
         <w:pStyle w:val="BodyText"/>
@@ -57592,8 +57766,8 @@
         <w:t xml:space="preserve">.</w:t>
       </w:r>
     </w:p>
-    <w:bookmarkEnd w:id="122"/>
-    <w:bookmarkStart w:id="123" w:name="def-hat-matrix"/>
+    <w:bookmarkEnd w:id="127"/>
+    <w:bookmarkStart w:id="128" w:name="def-hat-matrix"/>
     <w:p>
       <w:pPr>
         <w:pStyle w:val="BodyText"/>
@@ -58009,8 +58183,8 @@
         <w:t xml:space="preserve">.</w:t>
       </w:r>
     </w:p>
-    <w:bookmarkEnd w:id="123"/>
-    <w:bookmarkStart w:id="124" w:name="exm-hat-matrix"/>
+    <w:bookmarkEnd w:id="128"/>
+    <w:bookmarkStart w:id="129" w:name="exm-hat-matrix"/>
     <w:p>
       <w:pPr>
         <w:pStyle w:val="BodyText"/>
@@ -58545,8 +58719,8 @@
         <w:t xml:space="preserve">the fitted values of an intercept-only model are the sample mean.</w:t>
       </w:r>
     </w:p>
-    <w:bookmarkEnd w:id="124"/>
-    <w:bookmarkStart w:id="125" w:name="thm-hat-matrix"/>
+    <w:bookmarkEnd w:id="129"/>
+    <w:bookmarkStart w:id="130" w:name="thm-hat-matrix"/>
     <w:p>
       <w:pPr>
         <w:pStyle w:val="BodyText"/>
@@ -58697,7 +58871,7 @@
         <w:t xml:space="preserve">).</w:t>
       </w:r>
     </w:p>
-    <w:bookmarkEnd w:id="125"/>
+    <w:bookmarkEnd w:id="130"/>
     <w:p>
       <w:pPr>
         <w:pStyle w:val="BodyText"/>
@@ -60267,7 +60441,7 @@
         </m:oMath>
       </m:oMathPara>
     </w:p>
-    <w:bookmarkStart w:id="126" w:name="exm-hat-matrix-projection"/>
+    <w:bookmarkStart w:id="131" w:name="exm-hat-matrix-projection"/>
     <w:p>
       <w:pPr>
         <w:pStyle w:val="FirstParagraph"/>
@@ -60713,7 +60887,7 @@
         <w:t xml:space="preserve">says.</w:t>
       </w:r>
     </w:p>
-    <w:bookmarkEnd w:id="126"/>
+    <w:bookmarkEnd w:id="131"/>
     <w:p>
       <w:pPr>
         <w:pStyle w:val="BodyText"/>
@@ -60934,8 +61108,8 @@
         <w:t xml:space="preserve">— hence the name.</w:t>
       </w:r>
     </w:p>
-    <w:bookmarkEnd w:id="127"/>
-    <w:bookmarkStart w:id="128" w:name="sec-additional-resources"/>
+    <w:bookmarkEnd w:id="132"/>
+    <w:bookmarkStart w:id="133" w:name="sec-additional-resources"/>
     <w:p>
       <w:pPr>
         <w:pStyle w:val="Heading2"/>
@@ -60980,8 +61154,8 @@
         <w:t xml:space="preserve">Searle and Khuri (2017)</w:t>
       </w:r>
     </w:p>
-    <w:bookmarkEnd w:id="128"/>
-    <w:bookmarkStart w:id="139" w:name="references"/>
+    <w:bookmarkEnd w:id="133"/>
+    <w:bookmarkStart w:id="146" w:name="references"/>
     <w:p>
       <w:pPr>
         <w:pStyle w:val="Heading2"/>
@@ -60990,8 +61164,8 @@
         <w:t xml:space="preserve">References</w:t>
       </w:r>
     </w:p>
-    <w:bookmarkStart w:id="138" w:name="refs"/>
-    <w:bookmarkStart w:id="130" w:name="ref-banerjee2014linear"/>
+    <w:bookmarkStart w:id="145" w:name="refs"/>
+    <w:bookmarkStart w:id="135" w:name="ref-banerjee2014linear"/>
     <w:p>
       <w:pPr>
         <w:pStyle w:val="Bibliography"/>
@@ -61015,7 +61189,7 @@
       <w:r>
         <w:t xml:space="preserve"> </w:t>
       </w:r>
-      <w:hyperlink r:id="rId129">
+      <w:hyperlink r:id="rId134">
         <w:r>
           <w:rPr>
             <w:rStyle w:val="Hyperlink"/>
@@ -61027,8 +61201,8 @@
         <w:t xml:space="preserve">.</w:t>
       </w:r>
     </w:p>
-    <w:bookmarkEnd w:id="130"/>
-    <w:bookmarkStart w:id="132" w:name="ref-dobson4e"/>
+    <w:bookmarkEnd w:id="135"/>
+    <w:bookmarkStart w:id="137" w:name="ref-dobson4e"/>
     <w:p>
       <w:pPr>
         <w:pStyle w:val="Bibliography"/>
@@ -61052,7 +61226,7 @@
       <w:r>
         <w:t xml:space="preserve"> </w:t>
       </w:r>
-      <w:hyperlink r:id="rId131">
+      <w:hyperlink r:id="rId136">
         <w:r>
           <w:rPr>
             <w:rStyle w:val="Hyperlink"/>
@@ -61064,8 +61238,8 @@
         <w:t xml:space="preserve">.</w:t>
       </w:r>
     </w:p>
-    <w:bookmarkEnd w:id="132"/>
-    <w:bookmarkStart w:id="134" w:name="ref-fieller2018basics"/>
+    <w:bookmarkEnd w:id="137"/>
+    <w:bookmarkStart w:id="139" w:name="ref-fieller2018basics"/>
     <w:p>
       <w:pPr>
         <w:pStyle w:val="Bibliography"/>
@@ -61103,7 +61277,7 @@
       <w:r>
         <w:t xml:space="preserve"> </w:t>
       </w:r>
-      <w:hyperlink r:id="rId133">
+      <w:hyperlink r:id="rId138">
         <w:r>
           <w:rPr>
             <w:rStyle w:val="Hyperlink"/>
@@ -61115,8 +61289,87 @@
         <w:t xml:space="preserve">.</w:t>
       </w:r>
     </w:p>
-    <w:bookmarkEnd w:id="134"/>
-    <w:bookmarkStart w:id="136" w:name="ref-mosaiccalc"/>
+    <w:bookmarkEnd w:id="139"/>
+    <w:bookmarkStart w:id="141" w:name="ref-hutchinson_wwu_ml_videos"/>
+    <w:p>
+      <w:pPr>
+        <w:pStyle w:val="Bibliography"/>
+      </w:pPr>
+      <w:r>
+        <w:t xml:space="preserve">Hutchinson, Brian. n.d.</w:t>
+      </w:r>
+      <w:r>
+        <w:t xml:space="preserve"> </w:t>
+      </w:r>
+      <w:r>
+        <w:rPr>
+          <w:i/>
+          <w:iCs/>
+        </w:rPr>
+        <w:t xml:space="preserve">DATA</w:t>
+      </w:r>
+      <w:r>
+        <w:rPr>
+          <w:i/>
+          <w:iCs/>
+        </w:rPr>
+        <w:t xml:space="preserve"> </w:t>
+      </w:r>
+      <w:r>
+        <w:rPr>
+          <w:i/>
+          <w:iCs/>
+        </w:rPr>
+        <w:t xml:space="preserve">471/571 (Machine Learning) and</w:t>
+      </w:r>
+      <w:r>
+        <w:rPr>
+          <w:i/>
+          <w:iCs/>
+        </w:rPr>
+        <w:t xml:space="preserve"> </w:t>
+      </w:r>
+      <w:r>
+        <w:rPr>
+          <w:i/>
+          <w:iCs/>
+        </w:rPr>
+        <w:t xml:space="preserve">CSCI</w:t>
+      </w:r>
+      <w:r>
+        <w:rPr>
+          <w:i/>
+          <w:iCs/>
+        </w:rPr>
+        <w:t xml:space="preserve"> </w:t>
+      </w:r>
+      <w:r>
+        <w:rPr>
+          <w:i/>
+          <w:iCs/>
+        </w:rPr>
+        <w:t xml:space="preserve">481/581 (Deep Learning) Video Lectures</w:t>
+      </w:r>
+      <w:r>
+        <w:t xml:space="preserve">. Western Washington University. Accessed September 28, 2026.</w:t>
+      </w:r>
+      <w:r>
+        <w:t xml:space="preserve"> </w:t>
+      </w:r>
+      <w:hyperlink r:id="rId140">
+        <w:r>
+          <w:rPr>
+            <w:rStyle w:val="Hyperlink"/>
+          </w:rPr>
+          <w:t xml:space="preserve">https://facultyweb.cs.wwu.edu/~hutchib2/video_lectures/data371/</w:t>
+        </w:r>
+      </w:hyperlink>
+      <w:r>
+        <w:t xml:space="preserve">.</w:t>
+      </w:r>
+    </w:p>
+    <w:bookmarkEnd w:id="141"/>
+    <w:bookmarkStart w:id="143" w:name="ref-mosaiccalc"/>
     <w:p>
       <w:pPr>
         <w:pStyle w:val="Bibliography"/>
@@ -61140,7 +61393,7 @@
       <w:r>
         <w:t xml:space="preserve"> </w:t>
       </w:r>
-      <w:hyperlink r:id="rId135">
+      <w:hyperlink r:id="rId142">
         <w:r>
           <w:rPr>
             <w:rStyle w:val="Hyperlink"/>
@@ -61152,8 +61405,8 @@
         <w:t xml:space="preserve">.</w:t>
       </w:r>
     </w:p>
-    <w:bookmarkEnd w:id="136"/>
-    <w:bookmarkStart w:id="137" w:name="ref-searle2017matrix"/>
+    <w:bookmarkEnd w:id="143"/>
+    <w:bookmarkStart w:id="144" w:name="ref-searle2017matrix"/>
     <w:p>
       <w:pPr>
         <w:pStyle w:val="Bibliography"/>
@@ -61175,9 +61428,9 @@
         <w:t xml:space="preserve">. John Wiley &amp; Sons.</w:t>
       </w:r>
     </w:p>
-    <w:bookmarkEnd w:id="137"/>
-    <w:bookmarkEnd w:id="138"/>
-    <w:bookmarkEnd w:id="139"/>
+    <w:bookmarkEnd w:id="144"/>
+    <w:bookmarkEnd w:id="145"/>
+    <w:bookmarkEnd w:id="146"/>
     <w:sectPr>
       <w:footnotePr>
         <w:numRestart w:val="eachSect"/>

</xml_diff>